<commit_message>
Update gallery from Drive (2026-08-08 21:54)
</commit_message>
<xml_diff>
--- a/assets/artworks/Godot feltöltés JPG/Godot_adatlapok_13_munka.docx
+++ b/assets/artworks/Godot feltöltés JPG/Godot_adatlapok_13_munka.docx
@@ -199,7 +199,7 @@
               <w:rPr>
                 <w:rtl w:val="0"/>
               </w:rPr>
-              <w:t xml:space="preserve">2</w:t>
+              <w:t xml:space="preserve">2025</w:t>
             </w:r>
           </w:p>
         </w:tc>
@@ -500,7 +500,7 @@
               <w:rPr>
                 <w:rtl w:val="0"/>
               </w:rPr>
-              <w:t xml:space="preserve">340 000 Ft</w:t>
+              <w:t xml:space="preserve">250 000 Ft</w:t>
             </w:r>
           </w:p>
         </w:tc>
@@ -527,13 +527,20 @@
         <w:rPr>
           <w:rtl w:val="0"/>
         </w:rPr>
-        <w:t xml:space="preserve">A Bitte egy színpadszerű jelenetből indult ki, ahol két alak között valamilyen kérés, gesztus vagy hatalmi játék zajlik. Szeretem benne, hogy elsőre dekoratívnak és könnyednek tűnhet, közben mégis van benne valami kényelmetlen. A rózsaszín-arany tér és a nyersebb festői gesztusok közötti ellentétet akartam felerősíteni.</w:t>
+        <w:t xml:space="preserve">A német nyelvben azt mondjuk “bitte”, ha valamit kérünk. De akkor is, ha kínálunk valamit. Ha valamibe beleegyezünk. Még a köszönetre válaszként is. </w:t>
       </w:r>
     </w:p>
     <w:p>
       <w:pPr>
+        <w:spacing w:after="0" w:lineRule="auto"/>
         <w:rPr/>
       </w:pPr>
+      <w:r>
+        <w:rPr>
+          <w:rtl w:val="0"/>
+        </w:rPr>
+        <w:t xml:space="preserve">Ugyanabban a gesztusban egészen más dominancia- viszonyok lehetnek. A kép szereplői, legyenek bármilyen viszonyban egymással: ha az egyik leigázza a másikat és egy magasabb pozícióból kér tőle hogy “adj!”; Ha a másik önként kínál és ad, hogy “tessék". </w:t>
+      </w:r>
       <w:r>
         <w:br w:type="page"/>
       </w:r>
@@ -706,7 +713,7 @@
               <w:rPr>
                 <w:rtl w:val="0"/>
               </w:rPr>
-              <w:t xml:space="preserve">kitöltendő</w:t>
+              <w:t xml:space="preserve">2025</w:t>
             </w:r>
           </w:p>
         </w:tc>
@@ -1007,7 +1014,7 @@
               <w:rPr>
                 <w:rtl w:val="0"/>
               </w:rPr>
-              <w:t xml:space="preserve">330 000 Ft</w:t>
+              <w:t xml:space="preserve">250 000 Ft</w:t>
             </w:r>
           </w:p>
         </w:tc>
@@ -1213,7 +1220,7 @@
               <w:rPr>
                 <w:rtl w:val="0"/>
               </w:rPr>
-              <w:t xml:space="preserve">kitöltendő</w:t>
+              <w:t xml:space="preserve">2025</w:t>
             </w:r>
           </w:p>
         </w:tc>

</xml_diff>

<commit_message>
Update gallery from Drive (2026-08-08 22:54)
</commit_message>
<xml_diff>
--- a/assets/artworks/Godot feltöltés JPG/Godot_adatlapok_13_munka.docx
+++ b/assets/artworks/Godot feltöltés JPG/Godot_adatlapok_13_munka.docx
@@ -539,15 +539,9 @@
         <w:rPr>
           <w:rtl w:val="0"/>
         </w:rPr>
-        <w:t xml:space="preserve">Ugyanabban a gesztusban egészen más dominancia- viszonyok lehetnek. A kép szereplői, legyenek bármilyen viszonyban egymással: ha az egyik leigázza a másikat és egy magasabb pozícióból kér tőle hogy “adj!”; Ha a másik önként kínál és ad, hogy “tessék". </w:t>
-      </w:r>
-      <w:r>
-        <w:br w:type="page"/>
-      </w:r>
-      <w:r>
-        <w:rPr>
-          <w:rtl w:val="0"/>
-        </w:rPr>
+        <w:t xml:space="preserve">Ugyanabban a gesztusban egészen más dominancia- viszonyok lehetnek. A jelenet középpontjában egy egyszerű, mégis kétértelmű gesztus áll: az egyik alak a másik poharába tölt. A viszonyuk egyszerre lehet az is, hogy „tessék, adok”, de az is, hogy „tessék, itt a poharam, töltsd meg”. Az érdekelt, hogy egy udvariasnak tűnő mozdulatban hogyan lehet egyszerre jelen a gondoskodás, a kérés és a két ember közötti bizonytalan erőviszony. </w:t>
+        <w:br w:type="textWrapping"/>
+        <w:t xml:space="preserve">A kép mondanivalóját a formában is követni szerettem volna. A képeimen visszatérő elem a megfolyt festék. Értelmezés kérdése, hogy egy ez a túlcsorduló bőségnek, gazdagságnak a kifejeződése, vagy a deformitásnak és az eróziónak.</w:t>
       </w:r>
     </w:p>
     <w:p>
@@ -1041,7 +1035,40 @@
         <w:rPr>
           <w:rtl w:val="0"/>
         </w:rPr>
-        <w:t xml:space="preserve">A Zsül festésekor az érintés és a kiszolgáltatottság kettőssége foglalkoztatott. A figurák nem teljesen lezárt formák, inkább foltokból, mozdulatokból és elmosódásokból állnak össze. A meleg színek és a sűrű festékrétegek miatt a jelenet számomra egyszerre intim, nyugtalan és kissé rituális.</w:t>
+        <w:t xml:space="preserve">A “Zsül” festésekor az érintés és a kiszolgáltatottság kettőssége foglalkoztatott. A figurák nem teljesen lezárt formák, inkább foltokból, mozdulatokból és elmosódásokból állnak össze. A macskák a szeretetüket és a bizalmukat azzal a gesztussal fejezik ki, hogy ránk pillantva néhány másodpercre lehunyják a szemüket. Ezzel jelképesen egy pillanatra védtelenek és kiszolgáltatottak lesznek előttünk, hogy azt kommunikálják: megbíznak bennünk, hogy nem élünk vissza a sebezhetőségükkel. Ugyanilyen bizalom kell ahhoz, hogy mások előtt meztelenek legyünk és magunkról gondoskodjunk. A festmény központi szereplője - a vízbe ereszkedő alak - és a háttérben pihenő figura közti nyugodt légkörrel szerettem volna ezt a bizalmi viszonyt megjeleníteni.  A meleg színek és a sűrű festékrétegek miatt a jelenet számomra egyszerre intim, nyugtalan és kissé rituális.</w:t>
+      </w:r>
+    </w:p>
+    <w:p>
+      <w:pPr>
+        <w:spacing w:after="0" w:lineRule="auto"/>
+        <w:rPr/>
+      </w:pPr>
+      <w:r>
+        <w:rPr>
+          <w:rtl w:val="0"/>
+        </w:rPr>
+      </w:r>
+    </w:p>
+    <w:p>
+      <w:pPr>
+        <w:spacing w:after="0" w:lineRule="auto"/>
+        <w:rPr/>
+      </w:pPr>
+      <w:r>
+        <w:rPr>
+          <w:rtl w:val="0"/>
+        </w:rPr>
+      </w:r>
+    </w:p>
+    <w:p>
+      <w:pPr>
+        <w:spacing w:after="0" w:lineRule="auto"/>
+        <w:rPr/>
+      </w:pPr>
+      <w:r>
+        <w:rPr>
+          <w:rtl w:val="0"/>
+        </w:rPr>
       </w:r>
     </w:p>
     <w:p>
@@ -1521,7 +1548,7 @@
               <w:rPr>
                 <w:rtl w:val="0"/>
               </w:rPr>
-              <w:t xml:space="preserve">330 000 Ft</w:t>
+              <w:t xml:space="preserve">250 000 Ft</w:t>
             </w:r>
           </w:p>
         </w:tc>
@@ -2562,7 +2589,7 @@
         <w:rPr>
           <w:rtl w:val="0"/>
         </w:rPr>
-        <w:t xml:space="preserve">A welcome című képen egy olyan társas helyzetet kerestem, ahol nem teljesen egyértelmű, hogy a szereplők otthon vannak-e, vendégségben vannak-e, vagy inkább ki vannak állítva a néző tekintetének. A vörös és kék rétegek számomra egy sűrű, zárt hangulatot hoznak létre. A képben a befogadás, a szerepjáték és a jelenlét bizonytalansága érdekelt.</w:t>
+        <w:t xml:space="preserve">A welcome című képen egy olyan társas helyzetet kerestem, ahol a szereplők egy önfeledt helyzetben . A vörös és kék rétegek számomra egy sűrű, zárt hangulatot hoznak létre. A képben a befogadás, a szerepjáték és a jelenlét bizonytalansága érdekelt.</w:t>
       </w:r>
     </w:p>
     <w:p>

</xml_diff>

<commit_message>
Update gallery from Drive (2026-08-09 10:54)
</commit_message>
<xml_diff>
--- a/assets/artworks/Godot feltöltés JPG/Godot_adatlapok_13_munka.docx
+++ b/assets/artworks/Godot feltöltés JPG/Godot_adatlapok_13_munka.docx
@@ -3275,7 +3275,7 @@
               <w:rPr>
                 <w:rtl w:val="0"/>
               </w:rPr>
-              <w:t xml:space="preserve">kitöltendő</w:t>
+              <w:t xml:space="preserve">2022</w:t>
             </w:r>
           </w:p>
         </w:tc>
@@ -3782,7 +3782,7 @@
               <w:rPr>
                 <w:rtl w:val="0"/>
               </w:rPr>
-              <w:t xml:space="preserve">kitöltendő</w:t>
+              <w:t xml:space="preserve">2025</w:t>
             </w:r>
           </w:p>
         </w:tc>
@@ -4083,7 +4083,7 @@
               <w:rPr>
                 <w:rtl w:val="0"/>
               </w:rPr>
-              <w:t xml:space="preserve">150 000 Ft</w:t>
+              <w:t xml:space="preserve">99 000 Ft</w:t>
             </w:r>
           </w:p>
         </w:tc>
@@ -4289,7 +4289,7 @@
               <w:rPr>
                 <w:rtl w:val="0"/>
               </w:rPr>
-              <w:t xml:space="preserve">kitöltendő</w:t>
+              <w:t xml:space="preserve">2025</w:t>
             </w:r>
           </w:p>
         </w:tc>
@@ -4590,7 +4590,7 @@
               <w:rPr>
                 <w:rtl w:val="0"/>
               </w:rPr>
-              <w:t xml:space="preserve">150 000 Ft</w:t>
+              <w:t xml:space="preserve">99 000 Ft</w:t>
             </w:r>
           </w:p>
         </w:tc>
@@ -4796,7 +4796,7 @@
               <w:rPr>
                 <w:rtl w:val="0"/>
               </w:rPr>
-              <w:t xml:space="preserve">kitöltendő</w:t>
+              <w:t xml:space="preserve">2025</w:t>
             </w:r>
           </w:p>
         </w:tc>
@@ -5217,7 +5217,7 @@
               <w:rPr>
                 <w:rtl w:val="0"/>
               </w:rPr>
-              <w:t xml:space="preserve">G:\Saját meghajtó\siposbarni-web\assets\artworks\Godot feltöltés JPG\Torzó 4- olaj, alapozott papír 50x50cm.jpg</w:t>
+              <w:t xml:space="preserve">G:\Saját meghajtó\siposbarni-web\assets\artworks\Budapest\Bajza utca - olaj, farost, 50x40cm.jpg</w:t>
             </w:r>
           </w:p>
         </w:tc>
@@ -6618,7 +6618,7 @@
               <w:rPr>
                 <w:rtl w:val="0"/>
               </w:rPr>
-              <w:t xml:space="preserve">170 000 Ft</w:t>
+              <w:t xml:space="preserve">99 000 Ft</w:t>
             </w:r>
           </w:p>
         </w:tc>
@@ -6646,6 +6646,28 @@
           <w:rtl w:val="0"/>
         </w:rPr>
         <w:t xml:space="preserve">A vanegycigid egy intim, mégis nyugtalan jelenet. A cím szándékosan hétköznapi, mert érdekelt, hogyan tud egy egyszerű mondat mögött kapcsolódás, függés, vágy vagy kiszolgáltatottság megjelenni. A világító sárga háttérrel és a vörös foltokkal egy erős, kissé fojtott érzelmi teret szerettem volna létrehozni.</w:t>
+      </w:r>
+    </w:p>
+    <w:p>
+      <w:pPr>
+        <w:spacing w:after="0" w:lineRule="auto"/>
+        <w:rPr/>
+      </w:pPr>
+      <w:r>
+        <w:rPr>
+          <w:rtl w:val="0"/>
+        </w:rPr>
+      </w:r>
+    </w:p>
+    <w:p>
+      <w:pPr>
+        <w:spacing w:after="0" w:lineRule="auto"/>
+        <w:rPr/>
+      </w:pPr>
+      <w:r>
+        <w:rPr>
+          <w:rtl w:val="0"/>
+        </w:rPr>
       </w:r>
     </w:p>
     <w:sectPr>

</xml_diff>